<commit_message>
Actualice los documentos ERS y de cobertura
</commit_message>
<xml_diff>
--- a/documentos/Cobertura_Testing_BeautyInRose.docx
+++ b/documentos/Cobertura_Testing_BeautyInRose.docx
@@ -267,7 +267,7 @@
                 <w:sz w:val="20"/>
                 <w:szCs w:val="20"/>
               </w:rPr>
-              <w:t xml:space="preserve">63</w:t>
+              <w:t xml:space="preserve">66</w:t>
             </w:r>
           </w:p>
         </w:tc>
@@ -315,7 +315,7 @@
                 <w:sz w:val="20"/>
                 <w:szCs w:val="20"/>
               </w:rPr>
-              <w:t xml:space="preserve">63 de 63</w:t>
+              <w:t xml:space="preserve">66 de 66</w:t>
             </w:r>
           </w:p>
         </w:tc>
@@ -411,7 +411,7 @@
                 <w:sz w:val="20"/>
                 <w:szCs w:val="20"/>
               </w:rPr>
-              <w:t xml:space="preserve">86.52%</w:t>
+              <w:t xml:space="preserve">86.68%</w:t>
             </w:r>
           </w:p>
         </w:tc>
@@ -459,7 +459,7 @@
                 <w:sz w:val="20"/>
                 <w:szCs w:val="20"/>
               </w:rPr>
-              <w:t xml:space="preserve">77.72%</w:t>
+              <w:t xml:space="preserve">78.11%</w:t>
             </w:r>
           </w:p>
         </w:tc>
@@ -507,7 +507,7 @@
                 <w:sz w:val="20"/>
                 <w:szCs w:val="20"/>
               </w:rPr>
-              <w:t xml:space="preserve">81.06%</w:t>
+              <w:t xml:space="preserve">81.28%</w:t>
             </w:r>
           </w:p>
         </w:tc>
@@ -555,7 +555,7 @@
                 <w:sz w:val="20"/>
                 <w:szCs w:val="20"/>
               </w:rPr>
-              <w:t xml:space="preserve">87.35%</w:t>
+              <w:t xml:space="preserve">87.5%</w:t>
             </w:r>
           </w:p>
         </w:tc>
@@ -1878,7 +1878,7 @@
                 <w:sz w:val="20"/>
                 <w:szCs w:val="20"/>
               </w:rPr>
-              <w:t xml:space="preserve">22</w:t>
+              <w:t xml:space="preserve">24</w:t>
             </w:r>
           </w:p>
         </w:tc>
@@ -1949,7 +1949,7 @@
                 <w:sz w:val="20"/>
                 <w:szCs w:val="20"/>
               </w:rPr>
-              <w:t xml:space="preserve">13</w:t>
+              <w:t xml:space="preserve">14</w:t>
             </w:r>
           </w:p>
         </w:tc>
@@ -6410,7 +6410,7 @@
                 <w:sz w:val="20"/>
                 <w:szCs w:val="20"/>
               </w:rPr>
-              <w:t xml:space="preserve">crea el usuario con rol cliente cuando los datos son válidos</w:t>
+              <w:t xml:space="preserve">rechaza correos que no sean de gmail ni de duocuc</w:t>
             </w:r>
           </w:p>
         </w:tc>
@@ -6504,7 +6504,7 @@
                 <w:sz w:val="20"/>
                 <w:szCs w:val="20"/>
               </w:rPr>
-              <w:t xml:space="preserve">avisa cuando el correo ya está registrado</w:t>
+              <w:t xml:space="preserve">acepta correos de duocuc</w:t>
             </w:r>
           </w:p>
         </w:tc>
@@ -6575,7 +6575,7 @@
                 <w:sz w:val="20"/>
                 <w:szCs w:val="20"/>
               </w:rPr>
-              <w:t xml:space="preserve">Administración de usuarios y pedidos</w:t>
+              <w:t xml:space="preserve">Registro</w:t>
             </w:r>
           </w:p>
         </w:tc>
@@ -6598,7 +6598,7 @@
                 <w:sz w:val="20"/>
                 <w:szCs w:val="20"/>
               </w:rPr>
-              <w:t xml:space="preserve">AdminUsuarios cambia el rol de un usuario a vendedor</w:t>
+              <w:t xml:space="preserve">crea el usuario con rol cliente cuando los datos son válidos</w:t>
             </w:r>
           </w:p>
         </w:tc>
@@ -6669,7 +6669,7 @@
                 <w:sz w:val="20"/>
                 <w:szCs w:val="20"/>
               </w:rPr>
-              <w:t xml:space="preserve">Administración de usuarios y pedidos</w:t>
+              <w:t xml:space="preserve">Registro</w:t>
             </w:r>
           </w:p>
         </w:tc>
@@ -6692,7 +6692,7 @@
                 <w:sz w:val="20"/>
                 <w:szCs w:val="20"/>
               </w:rPr>
-              <w:t xml:space="preserve">AdminPedidos muestra un mensaje cuando no hay pedidos</w:t>
+              <w:t xml:space="preserve">avisa cuando el correo ya está registrado</w:t>
             </w:r>
           </w:p>
         </w:tc>
@@ -6786,7 +6786,7 @@
                 <w:sz w:val="20"/>
                 <w:szCs w:val="20"/>
               </w:rPr>
-              <w:t xml:space="preserve">AdminPedidos cambia el estado de un pedido</w:t>
+              <w:t xml:space="preserve">AdminUsuarios cambia el rol de un usuario a vendedor</w:t>
             </w:r>
           </w:p>
         </w:tc>
@@ -6834,30 +6834,30 @@
                 <w:sz w:val="20"/>
                 <w:szCs w:val="20"/>
               </w:rPr>
-              <w:t xml:space="preserve">utilidades.spec.jsx</w:t>
-            </w:r>
-          </w:p>
-        </w:tc>
-        <w:tc>
-          <w:tcPr>
-            <w:tcW w:type="dxa" w:w="2200"/>
-            <w:tcMar>
-              <w:top w:type="dxa" w:w="60"/>
-              <w:left w:type="dxa" w:w="100"/>
-              <w:bottom w:type="dxa" w:w="60"/>
-              <w:right w:type="dxa" w:w="100"/>
-            </w:tcMar>
-          </w:tcPr>
-          <w:p>
-            <w:r>
-              <w:rPr>
-                <w:rFonts w:ascii="Calibri" w:cs="Calibri" w:eastAsia="Calibri" w:hAnsi="Calibri"/>
-                <w:b w:val="false"/>
-                <w:bCs w:val="false"/>
-                <w:sz w:val="20"/>
-                <w:szCs w:val="20"/>
-              </w:rPr>
-              <w:t xml:space="preserve">formato</w:t>
+              <w:t xml:space="preserve">paginas.spec.jsx</w:t>
+            </w:r>
+          </w:p>
+        </w:tc>
+        <w:tc>
+          <w:tcPr>
+            <w:tcW w:type="dxa" w:w="2200"/>
+            <w:tcMar>
+              <w:top w:type="dxa" w:w="60"/>
+              <w:left w:type="dxa" w:w="100"/>
+              <w:bottom w:type="dxa" w:w="60"/>
+              <w:right w:type="dxa" w:w="100"/>
+            </w:tcMar>
+          </w:tcPr>
+          <w:p>
+            <w:r>
+              <w:rPr>
+                <w:rFonts w:ascii="Calibri" w:cs="Calibri" w:eastAsia="Calibri" w:hAnsi="Calibri"/>
+                <w:b w:val="false"/>
+                <w:bCs w:val="false"/>
+                <w:sz w:val="20"/>
+                <w:szCs w:val="20"/>
+              </w:rPr>
+              <w:t xml:space="preserve">Administración de usuarios y pedidos</w:t>
             </w:r>
           </w:p>
         </w:tc>
@@ -6880,7 +6880,7 @@
                 <w:sz w:val="20"/>
                 <w:szCs w:val="20"/>
               </w:rPr>
-              <w:t xml:space="preserve">formatearPrecio agrega el signo $ y el separador de miles</w:t>
+              <w:t xml:space="preserve">AdminPedidos muestra un mensaje cuando no hay pedidos</w:t>
             </w:r>
           </w:p>
         </w:tc>
@@ -6928,30 +6928,30 @@
                 <w:sz w:val="20"/>
                 <w:szCs w:val="20"/>
               </w:rPr>
-              <w:t xml:space="preserve">utilidades.spec.jsx</w:t>
-            </w:r>
-          </w:p>
-        </w:tc>
-        <w:tc>
-          <w:tcPr>
-            <w:tcW w:type="dxa" w:w="2200"/>
-            <w:tcMar>
-              <w:top w:type="dxa" w:w="60"/>
-              <w:left w:type="dxa" w:w="100"/>
-              <w:bottom w:type="dxa" w:w="60"/>
-              <w:right w:type="dxa" w:w="100"/>
-            </w:tcMar>
-          </w:tcPr>
-          <w:p>
-            <w:r>
-              <w:rPr>
-                <w:rFonts w:ascii="Calibri" w:cs="Calibri" w:eastAsia="Calibri" w:hAnsi="Calibri"/>
-                <w:b w:val="false"/>
-                <w:bCs w:val="false"/>
-                <w:sz w:val="20"/>
-                <w:szCs w:val="20"/>
-              </w:rPr>
-              <w:t xml:space="preserve">formato</w:t>
+              <w:t xml:space="preserve">paginas.spec.jsx</w:t>
+            </w:r>
+          </w:p>
+        </w:tc>
+        <w:tc>
+          <w:tcPr>
+            <w:tcW w:type="dxa" w:w="2200"/>
+            <w:tcMar>
+              <w:top w:type="dxa" w:w="60"/>
+              <w:left w:type="dxa" w:w="100"/>
+              <w:bottom w:type="dxa" w:w="60"/>
+              <w:right w:type="dxa" w:w="100"/>
+            </w:tcMar>
+          </w:tcPr>
+          <w:p>
+            <w:r>
+              <w:rPr>
+                <w:rFonts w:ascii="Calibri" w:cs="Calibri" w:eastAsia="Calibri" w:hAnsi="Calibri"/>
+                <w:b w:val="false"/>
+                <w:bCs w:val="false"/>
+                <w:sz w:val="20"/>
+                <w:szCs w:val="20"/>
+              </w:rPr>
+              <w:t xml:space="preserve">Administración de usuarios y pedidos</w:t>
             </w:r>
           </w:p>
         </w:tc>
@@ -6974,7 +6974,7 @@
                 <w:sz w:val="20"/>
                 <w:szCs w:val="20"/>
               </w:rPr>
-              <w:t xml:space="preserve">generarId quita tildes, espacios y mayúsculas</w:t>
+              <w:t xml:space="preserve">AdminPedidos cambia el estado de un pedido</w:t>
             </w:r>
           </w:p>
         </w:tc>
@@ -7068,7 +7068,7 @@
                 <w:sz w:val="20"/>
                 <w:szCs w:val="20"/>
               </w:rPr>
-              <w:t xml:space="preserve">precioFinal devuelve el precio de oferta cuando existe</w:t>
+              <w:t xml:space="preserve">formatearPrecio agrega el signo $ y el separador de miles</w:t>
             </w:r>
           </w:p>
         </w:tc>
@@ -7162,7 +7162,7 @@
                 <w:sz w:val="20"/>
                 <w:szCs w:val="20"/>
               </w:rPr>
-              <w:t xml:space="preserve">porcentajeDescuento calcula el descuento en porcentaje</w:t>
+              <w:t xml:space="preserve">generarId quita tildes, espacios y mayúsculas</w:t>
             </w:r>
           </w:p>
         </w:tc>
@@ -7233,7 +7233,7 @@
                 <w:sz w:val="20"/>
                 <w:szCs w:val="20"/>
               </w:rPr>
-              <w:t xml:space="preserve">validaciones</w:t>
+              <w:t xml:space="preserve">formato</w:t>
             </w:r>
           </w:p>
         </w:tc>
@@ -7256,7 +7256,7 @@
                 <w:sz w:val="20"/>
                 <w:szCs w:val="20"/>
               </w:rPr>
-              <w:t xml:space="preserve">validarCorreo acepta un correo correcto y rechaza uno incorrecto</w:t>
+              <w:t xml:space="preserve">precioFinal devuelve el precio de oferta cuando existe</w:t>
             </w:r>
           </w:p>
         </w:tc>
@@ -7327,7 +7327,7 @@
                 <w:sz w:val="20"/>
                 <w:szCs w:val="20"/>
               </w:rPr>
-              <w:t xml:space="preserve">validaciones</w:t>
+              <w:t xml:space="preserve">formato</w:t>
             </w:r>
           </w:p>
         </w:tc>
@@ -7350,7 +7350,7 @@
                 <w:sz w:val="20"/>
                 <w:szCs w:val="20"/>
               </w:rPr>
-              <w:t xml:space="preserve">validarPassword exige 8 caracteres, una mayúscula y un número</w:t>
+              <w:t xml:space="preserve">porcentajeDescuento calcula el descuento en porcentaje</w:t>
             </w:r>
           </w:p>
         </w:tc>
@@ -7444,7 +7444,7 @@
                 <w:sz w:val="20"/>
                 <w:szCs w:val="20"/>
               </w:rPr>
-              <w:t xml:space="preserve">validarNombre pide mínimo 3 caracteres</w:t>
+              <w:t xml:space="preserve">validarCorreo acepta un correo correcto y rechaza uno incorrecto</w:t>
             </w:r>
           </w:p>
         </w:tc>
@@ -7538,7 +7538,7 @@
                 <w:sz w:val="20"/>
                 <w:szCs w:val="20"/>
               </w:rPr>
-              <w:t xml:space="preserve">validarMensaje pide mínimo 10 caracteres</w:t>
+              <w:t xml:space="preserve">validarCorreoPermitido solo acepta gmail.com y duocuc.cl</w:t>
             </w:r>
           </w:p>
         </w:tc>
@@ -7632,7 +7632,7 @@
                 <w:sz w:val="20"/>
                 <w:szCs w:val="20"/>
               </w:rPr>
-              <w:t xml:space="preserve">validarTarjeta exige 16 dígitos (con o sin espacios)</w:t>
+              <w:t xml:space="preserve">validarPassword exige 8 caracteres, una mayúscula y un número</w:t>
             </w:r>
           </w:p>
         </w:tc>
@@ -7703,7 +7703,7 @@
                 <w:sz w:val="20"/>
                 <w:szCs w:val="20"/>
               </w:rPr>
-              <w:t xml:space="preserve">filtros</w:t>
+              <w:t xml:space="preserve">validaciones</w:t>
             </w:r>
           </w:p>
         </w:tc>
@@ -7726,7 +7726,7 @@
                 <w:sz w:val="20"/>
                 <w:szCs w:val="20"/>
               </w:rPr>
-              <w:t xml:space="preserve">obtenerCategorias devuelve las categorías sin repetir</w:t>
+              <w:t xml:space="preserve">validarNombre pide mínimo 3 caracteres</w:t>
             </w:r>
           </w:p>
         </w:tc>
@@ -7797,7 +7797,7 @@
                 <w:sz w:val="20"/>
                 <w:szCs w:val="20"/>
               </w:rPr>
-              <w:t xml:space="preserve">filtros</w:t>
+              <w:t xml:space="preserve">validaciones</w:t>
             </w:r>
           </w:p>
         </w:tc>
@@ -7820,7 +7820,7 @@
                 <w:sz w:val="20"/>
                 <w:szCs w:val="20"/>
               </w:rPr>
-              <w:t xml:space="preserve">filtrarProductos busca por texto</w:t>
+              <w:t xml:space="preserve">validarMensaje pide mínimo 10 caracteres</w:t>
             </w:r>
           </w:p>
         </w:tc>
@@ -7891,7 +7891,7 @@
                 <w:sz w:val="20"/>
                 <w:szCs w:val="20"/>
               </w:rPr>
-              <w:t xml:space="preserve">filtros</w:t>
+              <w:t xml:space="preserve">validaciones</w:t>
             </w:r>
           </w:p>
         </w:tc>
@@ -7914,7 +7914,7 @@
                 <w:sz w:val="20"/>
                 <w:szCs w:val="20"/>
               </w:rPr>
-              <w:t xml:space="preserve">filtrarProductos filtra por categoría</w:t>
+              <w:t xml:space="preserve">validarTarjeta exige 16 dígitos (con o sin espacios)</w:t>
             </w:r>
           </w:p>
         </w:tc>
@@ -7940,6 +7940,288 @@
                 <w:szCs w:val="20"/>
               </w:rPr>
               <w:t xml:space="preserve">63</w:t>
+            </w:r>
+          </w:p>
+        </w:tc>
+        <w:tc>
+          <w:tcPr>
+            <w:tcW w:type="dxa" w:w="2200"/>
+            <w:tcMar>
+              <w:top w:type="dxa" w:w="60"/>
+              <w:left w:type="dxa" w:w="100"/>
+              <w:bottom w:type="dxa" w:w="60"/>
+              <w:right w:type="dxa" w:w="100"/>
+            </w:tcMar>
+          </w:tcPr>
+          <w:p>
+            <w:r>
+              <w:rPr>
+                <w:rFonts w:ascii="Calibri" w:cs="Calibri" w:eastAsia="Calibri" w:hAnsi="Calibri"/>
+                <w:b w:val="false"/>
+                <w:bCs w:val="false"/>
+                <w:sz w:val="20"/>
+                <w:szCs w:val="20"/>
+              </w:rPr>
+              <w:t xml:space="preserve">utilidades.spec.jsx</w:t>
+            </w:r>
+          </w:p>
+        </w:tc>
+        <w:tc>
+          <w:tcPr>
+            <w:tcW w:type="dxa" w:w="2200"/>
+            <w:tcMar>
+              <w:top w:type="dxa" w:w="60"/>
+              <w:left w:type="dxa" w:w="100"/>
+              <w:bottom w:type="dxa" w:w="60"/>
+              <w:right w:type="dxa" w:w="100"/>
+            </w:tcMar>
+          </w:tcPr>
+          <w:p>
+            <w:r>
+              <w:rPr>
+                <w:rFonts w:ascii="Calibri" w:cs="Calibri" w:eastAsia="Calibri" w:hAnsi="Calibri"/>
+                <w:b w:val="false"/>
+                <w:bCs w:val="false"/>
+                <w:sz w:val="20"/>
+                <w:szCs w:val="20"/>
+              </w:rPr>
+              <w:t xml:space="preserve">filtros</w:t>
+            </w:r>
+          </w:p>
+        </w:tc>
+        <w:tc>
+          <w:tcPr>
+            <w:tcW w:type="dxa" w:w="4600"/>
+            <w:tcMar>
+              <w:top w:type="dxa" w:w="60"/>
+              <w:left w:type="dxa" w:w="100"/>
+              <w:bottom w:type="dxa" w:w="60"/>
+              <w:right w:type="dxa" w:w="100"/>
+            </w:tcMar>
+          </w:tcPr>
+          <w:p>
+            <w:r>
+              <w:rPr>
+                <w:rFonts w:ascii="Calibri" w:cs="Calibri" w:eastAsia="Calibri" w:hAnsi="Calibri"/>
+                <w:b w:val="false"/>
+                <w:bCs w:val="false"/>
+                <w:sz w:val="20"/>
+                <w:szCs w:val="20"/>
+              </w:rPr>
+              <w:t xml:space="preserve">obtenerCategorias devuelve las categorías sin repetir</w:t>
+            </w:r>
+          </w:p>
+        </w:tc>
+      </w:tr>
+      <w:tr>
+        <w:tc>
+          <w:tcPr>
+            <w:tcW w:type="dxa" w:w="600"/>
+            <w:tcMar>
+              <w:top w:type="dxa" w:w="60"/>
+              <w:left w:type="dxa" w:w="100"/>
+              <w:bottom w:type="dxa" w:w="60"/>
+              <w:right w:type="dxa" w:w="100"/>
+            </w:tcMar>
+          </w:tcPr>
+          <w:p>
+            <w:r>
+              <w:rPr>
+                <w:rFonts w:ascii="Calibri" w:cs="Calibri" w:eastAsia="Calibri" w:hAnsi="Calibri"/>
+                <w:b w:val="false"/>
+                <w:bCs w:val="false"/>
+                <w:sz w:val="20"/>
+                <w:szCs w:val="20"/>
+              </w:rPr>
+              <w:t xml:space="preserve">64</w:t>
+            </w:r>
+          </w:p>
+        </w:tc>
+        <w:tc>
+          <w:tcPr>
+            <w:tcW w:type="dxa" w:w="2200"/>
+            <w:tcMar>
+              <w:top w:type="dxa" w:w="60"/>
+              <w:left w:type="dxa" w:w="100"/>
+              <w:bottom w:type="dxa" w:w="60"/>
+              <w:right w:type="dxa" w:w="100"/>
+            </w:tcMar>
+          </w:tcPr>
+          <w:p>
+            <w:r>
+              <w:rPr>
+                <w:rFonts w:ascii="Calibri" w:cs="Calibri" w:eastAsia="Calibri" w:hAnsi="Calibri"/>
+                <w:b w:val="false"/>
+                <w:bCs w:val="false"/>
+                <w:sz w:val="20"/>
+                <w:szCs w:val="20"/>
+              </w:rPr>
+              <w:t xml:space="preserve">utilidades.spec.jsx</w:t>
+            </w:r>
+          </w:p>
+        </w:tc>
+        <w:tc>
+          <w:tcPr>
+            <w:tcW w:type="dxa" w:w="2200"/>
+            <w:tcMar>
+              <w:top w:type="dxa" w:w="60"/>
+              <w:left w:type="dxa" w:w="100"/>
+              <w:bottom w:type="dxa" w:w="60"/>
+              <w:right w:type="dxa" w:w="100"/>
+            </w:tcMar>
+          </w:tcPr>
+          <w:p>
+            <w:r>
+              <w:rPr>
+                <w:rFonts w:ascii="Calibri" w:cs="Calibri" w:eastAsia="Calibri" w:hAnsi="Calibri"/>
+                <w:b w:val="false"/>
+                <w:bCs w:val="false"/>
+                <w:sz w:val="20"/>
+                <w:szCs w:val="20"/>
+              </w:rPr>
+              <w:t xml:space="preserve">filtros</w:t>
+            </w:r>
+          </w:p>
+        </w:tc>
+        <w:tc>
+          <w:tcPr>
+            <w:tcW w:type="dxa" w:w="4600"/>
+            <w:tcMar>
+              <w:top w:type="dxa" w:w="60"/>
+              <w:left w:type="dxa" w:w="100"/>
+              <w:bottom w:type="dxa" w:w="60"/>
+              <w:right w:type="dxa" w:w="100"/>
+            </w:tcMar>
+          </w:tcPr>
+          <w:p>
+            <w:r>
+              <w:rPr>
+                <w:rFonts w:ascii="Calibri" w:cs="Calibri" w:eastAsia="Calibri" w:hAnsi="Calibri"/>
+                <w:b w:val="false"/>
+                <w:bCs w:val="false"/>
+                <w:sz w:val="20"/>
+                <w:szCs w:val="20"/>
+              </w:rPr>
+              <w:t xml:space="preserve">filtrarProductos busca por texto</w:t>
+            </w:r>
+          </w:p>
+        </w:tc>
+      </w:tr>
+      <w:tr>
+        <w:tc>
+          <w:tcPr>
+            <w:tcW w:type="dxa" w:w="600"/>
+            <w:tcMar>
+              <w:top w:type="dxa" w:w="60"/>
+              <w:left w:type="dxa" w:w="100"/>
+              <w:bottom w:type="dxa" w:w="60"/>
+              <w:right w:type="dxa" w:w="100"/>
+            </w:tcMar>
+          </w:tcPr>
+          <w:p>
+            <w:r>
+              <w:rPr>
+                <w:rFonts w:ascii="Calibri" w:cs="Calibri" w:eastAsia="Calibri" w:hAnsi="Calibri"/>
+                <w:b w:val="false"/>
+                <w:bCs w:val="false"/>
+                <w:sz w:val="20"/>
+                <w:szCs w:val="20"/>
+              </w:rPr>
+              <w:t xml:space="preserve">65</w:t>
+            </w:r>
+          </w:p>
+        </w:tc>
+        <w:tc>
+          <w:tcPr>
+            <w:tcW w:type="dxa" w:w="2200"/>
+            <w:tcMar>
+              <w:top w:type="dxa" w:w="60"/>
+              <w:left w:type="dxa" w:w="100"/>
+              <w:bottom w:type="dxa" w:w="60"/>
+              <w:right w:type="dxa" w:w="100"/>
+            </w:tcMar>
+          </w:tcPr>
+          <w:p>
+            <w:r>
+              <w:rPr>
+                <w:rFonts w:ascii="Calibri" w:cs="Calibri" w:eastAsia="Calibri" w:hAnsi="Calibri"/>
+                <w:b w:val="false"/>
+                <w:bCs w:val="false"/>
+                <w:sz w:val="20"/>
+                <w:szCs w:val="20"/>
+              </w:rPr>
+              <w:t xml:space="preserve">utilidades.spec.jsx</w:t>
+            </w:r>
+          </w:p>
+        </w:tc>
+        <w:tc>
+          <w:tcPr>
+            <w:tcW w:type="dxa" w:w="2200"/>
+            <w:tcMar>
+              <w:top w:type="dxa" w:w="60"/>
+              <w:left w:type="dxa" w:w="100"/>
+              <w:bottom w:type="dxa" w:w="60"/>
+              <w:right w:type="dxa" w:w="100"/>
+            </w:tcMar>
+          </w:tcPr>
+          <w:p>
+            <w:r>
+              <w:rPr>
+                <w:rFonts w:ascii="Calibri" w:cs="Calibri" w:eastAsia="Calibri" w:hAnsi="Calibri"/>
+                <w:b w:val="false"/>
+                <w:bCs w:val="false"/>
+                <w:sz w:val="20"/>
+                <w:szCs w:val="20"/>
+              </w:rPr>
+              <w:t xml:space="preserve">filtros</w:t>
+            </w:r>
+          </w:p>
+        </w:tc>
+        <w:tc>
+          <w:tcPr>
+            <w:tcW w:type="dxa" w:w="4600"/>
+            <w:tcMar>
+              <w:top w:type="dxa" w:w="60"/>
+              <w:left w:type="dxa" w:w="100"/>
+              <w:bottom w:type="dxa" w:w="60"/>
+              <w:right w:type="dxa" w:w="100"/>
+            </w:tcMar>
+          </w:tcPr>
+          <w:p>
+            <w:r>
+              <w:rPr>
+                <w:rFonts w:ascii="Calibri" w:cs="Calibri" w:eastAsia="Calibri" w:hAnsi="Calibri"/>
+                <w:b w:val="false"/>
+                <w:bCs w:val="false"/>
+                <w:sz w:val="20"/>
+                <w:szCs w:val="20"/>
+              </w:rPr>
+              <w:t xml:space="preserve">filtrarProductos filtra por categoría</w:t>
+            </w:r>
+          </w:p>
+        </w:tc>
+      </w:tr>
+      <w:tr>
+        <w:tc>
+          <w:tcPr>
+            <w:tcW w:type="dxa" w:w="600"/>
+            <w:tcMar>
+              <w:top w:type="dxa" w:w="60"/>
+              <w:left w:type="dxa" w:w="100"/>
+              <w:bottom w:type="dxa" w:w="60"/>
+              <w:right w:type="dxa" w:w="100"/>
+            </w:tcMar>
+          </w:tcPr>
+          <w:p>
+            <w:r>
+              <w:rPr>
+                <w:rFonts w:ascii="Calibri" w:cs="Calibri" w:eastAsia="Calibri" w:hAnsi="Calibri"/>
+                <w:b w:val="false"/>
+                <w:bCs w:val="false"/>
+                <w:sz w:val="20"/>
+                <w:szCs w:val="20"/>
+              </w:rPr>
+              <w:t xml:space="preserve">66</w:t>
             </w:r>
           </w:p>
         </w:tc>
@@ -8442,7 +8724,7 @@
                 <w:sz w:val="20"/>
                 <w:szCs w:val="20"/>
               </w:rPr>
-              <w:t xml:space="preserve">components/FiltroCategorias.jsx</w:t>
+              <w:t xml:space="preserve">components/EncabezadoPagina.jsx</w:t>
             </w:r>
           </w:p>
         </w:tc>
@@ -8559,7 +8841,7 @@
                 <w:sz w:val="20"/>
                 <w:szCs w:val="20"/>
               </w:rPr>
-              <w:t xml:space="preserve">components/ItemCarrito.jsx</w:t>
+              <w:t xml:space="preserve">components/FiltroCategorias.jsx</w:t>
             </w:r>
           </w:p>
         </w:tc>
@@ -8676,7 +8958,7 @@
                 <w:sz w:val="20"/>
                 <w:szCs w:val="20"/>
               </w:rPr>
-              <w:t xml:space="preserve">components/ListaProductos.jsx</w:t>
+              <w:t xml:space="preserve">components/ItemCarrito.jsx</w:t>
             </w:r>
           </w:p>
         </w:tc>
@@ -8793,7 +9075,7 @@
                 <w:sz w:val="20"/>
                 <w:szCs w:val="20"/>
               </w:rPr>
-              <w:t xml:space="preserve">components/RutaAdmin.jsx</w:t>
+              <w:t xml:space="preserve">components/ListaProductos.jsx</w:t>
             </w:r>
           </w:p>
         </w:tc>
@@ -8910,7 +9192,7 @@
                 <w:sz w:val="20"/>
                 <w:szCs w:val="20"/>
               </w:rPr>
-              <w:t xml:space="preserve">components/TarjetaProducto.jsx</w:t>
+              <w:t xml:space="preserve">components/RutaAdmin.jsx</w:t>
             </w:r>
           </w:p>
         </w:tc>
@@ -9027,7 +9309,7 @@
                 <w:sz w:val="20"/>
                 <w:szCs w:val="20"/>
               </w:rPr>
-              <w:t xml:space="preserve">context/CarritoContext.jsx</w:t>
+              <w:t xml:space="preserve">components/TarjetaProducto.jsx</w:t>
             </w:r>
           </w:p>
         </w:tc>
@@ -9050,7 +9332,7 @@
                 <w:sz w:val="20"/>
                 <w:szCs w:val="20"/>
               </w:rPr>
-              <w:t xml:space="preserve">65.51%</w:t>
+              <w:t xml:space="preserve">100%</w:t>
             </w:r>
           </w:p>
         </w:tc>
@@ -9073,7 +9355,7 @@
                 <w:sz w:val="20"/>
                 <w:szCs w:val="20"/>
               </w:rPr>
-              <w:t xml:space="preserve">16.66%</w:t>
+              <w:t xml:space="preserve">100%</w:t>
             </w:r>
           </w:p>
         </w:tc>
@@ -9096,7 +9378,7 @@
                 <w:sz w:val="20"/>
                 <w:szCs w:val="20"/>
               </w:rPr>
-              <w:t xml:space="preserve">68.75%</w:t>
+              <w:t xml:space="preserve">100%</w:t>
             </w:r>
           </w:p>
         </w:tc>
@@ -9119,7 +9401,7 @@
                 <w:sz w:val="20"/>
                 <w:szCs w:val="20"/>
               </w:rPr>
-              <w:t xml:space="preserve">66.66%</w:t>
+              <w:t xml:space="preserve">100%</w:t>
             </w:r>
           </w:p>
         </w:tc>
@@ -9144,7 +9426,7 @@
                 <w:sz w:val="20"/>
                 <w:szCs w:val="20"/>
               </w:rPr>
-              <w:t xml:space="preserve">context/SesionContext.jsx</w:t>
+              <w:t xml:space="preserve">context/CarritoContext.jsx</w:t>
             </w:r>
           </w:p>
         </w:tc>
@@ -9167,7 +9449,7 @@
                 <w:sz w:val="20"/>
                 <w:szCs w:val="20"/>
               </w:rPr>
-              <w:t xml:space="preserve">90%</w:t>
+              <w:t xml:space="preserve">65.51%</w:t>
             </w:r>
           </w:p>
         </w:tc>
@@ -9190,7 +9472,7 @@
                 <w:sz w:val="20"/>
                 <w:szCs w:val="20"/>
               </w:rPr>
-              <w:t xml:space="preserve">100%</w:t>
+              <w:t xml:space="preserve">16.66%</w:t>
             </w:r>
           </w:p>
         </w:tc>
@@ -9213,7 +9495,7 @@
                 <w:sz w:val="20"/>
                 <w:szCs w:val="20"/>
               </w:rPr>
-              <w:t xml:space="preserve">83.33%</w:t>
+              <w:t xml:space="preserve">68.75%</w:t>
             </w:r>
           </w:p>
         </w:tc>
@@ -9236,7 +9518,7 @@
                 <w:sz w:val="20"/>
                 <w:szCs w:val="20"/>
               </w:rPr>
-              <w:t xml:space="preserve">90%</w:t>
+              <w:t xml:space="preserve">66.66%</w:t>
             </w:r>
           </w:p>
         </w:tc>
@@ -9261,7 +9543,7 @@
                 <w:sz w:val="20"/>
                 <w:szCs w:val="20"/>
               </w:rPr>
-              <w:t xml:space="preserve">context/TiendaContext.jsx</w:t>
+              <w:t xml:space="preserve">context/SesionContext.jsx</w:t>
             </w:r>
           </w:p>
         </w:tc>
@@ -9284,7 +9566,7 @@
                 <w:sz w:val="20"/>
                 <w:szCs w:val="20"/>
               </w:rPr>
-              <w:t xml:space="preserve">76.92%</w:t>
+              <w:t xml:space="preserve">90%</w:t>
             </w:r>
           </w:p>
         </w:tc>
@@ -9330,7 +9612,7 @@
                 <w:sz w:val="20"/>
                 <w:szCs w:val="20"/>
               </w:rPr>
-              <w:t xml:space="preserve">72.72%</w:t>
+              <w:t xml:space="preserve">83.33%</w:t>
             </w:r>
           </w:p>
         </w:tc>
@@ -9353,7 +9635,7 @@
                 <w:sz w:val="20"/>
                 <w:szCs w:val="20"/>
               </w:rPr>
-              <w:t xml:space="preserve">76.92%</w:t>
+              <w:t xml:space="preserve">90%</w:t>
             </w:r>
           </w:p>
         </w:tc>
@@ -9378,7 +9660,7 @@
                 <w:sz w:val="20"/>
                 <w:szCs w:val="20"/>
               </w:rPr>
-              <w:t xml:space="preserve">data/baseDatos.js</w:t>
+              <w:t xml:space="preserve">context/TiendaContext.jsx</w:t>
             </w:r>
           </w:p>
         </w:tc>
@@ -9401,7 +9683,7 @@
                 <w:sz w:val="20"/>
                 <w:szCs w:val="20"/>
               </w:rPr>
-              <w:t xml:space="preserve">87.5%</w:t>
+              <w:t xml:space="preserve">76.92%</w:t>
             </w:r>
           </w:p>
         </w:tc>
@@ -9424,7 +9706,7 @@
                 <w:sz w:val="20"/>
                 <w:szCs w:val="20"/>
               </w:rPr>
-              <w:t xml:space="preserve">78.57%</w:t>
+              <w:t xml:space="preserve">100%</w:t>
             </w:r>
           </w:p>
         </w:tc>
@@ -9447,7 +9729,7 @@
                 <w:sz w:val="20"/>
                 <w:szCs w:val="20"/>
               </w:rPr>
-              <w:t xml:space="preserve">81.25%</w:t>
+              <w:t xml:space="preserve">72.72%</w:t>
             </w:r>
           </w:p>
         </w:tc>
@@ -9470,7 +9752,7 @@
                 <w:sz w:val="20"/>
                 <w:szCs w:val="20"/>
               </w:rPr>
-              <w:t xml:space="preserve">89.23%</w:t>
+              <w:t xml:space="preserve">76.92%</w:t>
             </w:r>
           </w:p>
         </w:tc>
@@ -9495,7 +9777,7 @@
                 <w:sz w:val="20"/>
                 <w:szCs w:val="20"/>
               </w:rPr>
-              <w:t xml:space="preserve">data/productosIniciales.js</w:t>
+              <w:t xml:space="preserve">data/baseDatos.js</w:t>
             </w:r>
           </w:p>
         </w:tc>
@@ -9518,7 +9800,7 @@
                 <w:sz w:val="20"/>
                 <w:szCs w:val="20"/>
               </w:rPr>
-              <w:t xml:space="preserve">100%</w:t>
+              <w:t xml:space="preserve">87.5%</w:t>
             </w:r>
           </w:p>
         </w:tc>
@@ -9541,7 +9823,7 @@
                 <w:sz w:val="20"/>
                 <w:szCs w:val="20"/>
               </w:rPr>
-              <w:t xml:space="preserve">100%</w:t>
+              <w:t xml:space="preserve">78.57%</w:t>
             </w:r>
           </w:p>
         </w:tc>
@@ -9564,7 +9846,7 @@
                 <w:sz w:val="20"/>
                 <w:szCs w:val="20"/>
               </w:rPr>
-              <w:t xml:space="preserve">100%</w:t>
+              <w:t xml:space="preserve">81.25%</w:t>
             </w:r>
           </w:p>
         </w:tc>
@@ -9587,7 +9869,7 @@
                 <w:sz w:val="20"/>
                 <w:szCs w:val="20"/>
               </w:rPr>
-              <w:t xml:space="preserve">100%</w:t>
+              <w:t xml:space="preserve">89.23%</w:t>
             </w:r>
           </w:p>
         </w:tc>
@@ -9612,7 +9894,7 @@
                 <w:sz w:val="20"/>
                 <w:szCs w:val="20"/>
               </w:rPr>
-              <w:t xml:space="preserve">pages/Carrito.jsx</w:t>
+              <w:t xml:space="preserve">data/productosIniciales.js</w:t>
             </w:r>
           </w:p>
         </w:tc>
@@ -9729,7 +10011,7 @@
                 <w:sz w:val="20"/>
                 <w:szCs w:val="20"/>
               </w:rPr>
-              <w:t xml:space="preserve">pages/Checkout.jsx</w:t>
+              <w:t xml:space="preserve">pages/Carrito.jsx</w:t>
             </w:r>
           </w:p>
         </w:tc>
@@ -9752,7 +10034,7 @@
                 <w:sz w:val="20"/>
                 <w:szCs w:val="20"/>
               </w:rPr>
-              <w:t xml:space="preserve">91.66%</w:t>
+              <w:t xml:space="preserve">100%</w:t>
             </w:r>
           </w:p>
         </w:tc>
@@ -9775,7 +10057,7 @@
                 <w:sz w:val="20"/>
                 <w:szCs w:val="20"/>
               </w:rPr>
-              <w:t xml:space="preserve">76.47%</w:t>
+              <w:t xml:space="preserve">100%</w:t>
             </w:r>
           </w:p>
         </w:tc>
@@ -9798,7 +10080,7 @@
                 <w:sz w:val="20"/>
                 <w:szCs w:val="20"/>
               </w:rPr>
-              <w:t xml:space="preserve">76.47%</w:t>
+              <w:t xml:space="preserve">100%</w:t>
             </w:r>
           </w:p>
         </w:tc>
@@ -9821,7 +10103,7 @@
                 <w:sz w:val="20"/>
                 <w:szCs w:val="20"/>
               </w:rPr>
-              <w:t xml:space="preserve">91.48%</w:t>
+              <w:t xml:space="preserve">100%</w:t>
             </w:r>
           </w:p>
         </w:tc>
@@ -9846,7 +10128,7 @@
                 <w:sz w:val="20"/>
                 <w:szCs w:val="20"/>
               </w:rPr>
-              <w:t xml:space="preserve">pages/CompraExitosa.jsx</w:t>
+              <w:t xml:space="preserve">pages/Checkout.jsx</w:t>
             </w:r>
           </w:p>
         </w:tc>
@@ -9869,7 +10151,7 @@
                 <w:sz w:val="20"/>
                 <w:szCs w:val="20"/>
               </w:rPr>
-              <w:t xml:space="preserve">83.33%</w:t>
+              <w:t xml:space="preserve">91.66%</w:t>
             </w:r>
           </w:p>
         </w:tc>
@@ -9892,7 +10174,7 @@
                 <w:sz w:val="20"/>
                 <w:szCs w:val="20"/>
               </w:rPr>
-              <w:t xml:space="preserve">50%</w:t>
+              <w:t xml:space="preserve">76.47%</w:t>
             </w:r>
           </w:p>
         </w:tc>
@@ -9915,7 +10197,7 @@
                 <w:sz w:val="20"/>
                 <w:szCs w:val="20"/>
               </w:rPr>
-              <w:t xml:space="preserve">100%</w:t>
+              <w:t xml:space="preserve">76.47%</w:t>
             </w:r>
           </w:p>
         </w:tc>
@@ -9938,7 +10220,7 @@
                 <w:sz w:val="20"/>
                 <w:szCs w:val="20"/>
               </w:rPr>
-              <w:t xml:space="preserve">83.33%</w:t>
+              <w:t xml:space="preserve">91.48%</w:t>
             </w:r>
           </w:p>
         </w:tc>
@@ -9963,7 +10245,7 @@
                 <w:sz w:val="20"/>
                 <w:szCs w:val="20"/>
               </w:rPr>
-              <w:t xml:space="preserve">pages/CompraFallida.jsx</w:t>
+              <w:t xml:space="preserve">pages/CompraExitosa.jsx</w:t>
             </w:r>
           </w:p>
         </w:tc>
@@ -9986,6 +10268,52 @@
                 <w:sz w:val="20"/>
                 <w:szCs w:val="20"/>
               </w:rPr>
+              <w:t xml:space="preserve">83.33%</w:t>
+            </w:r>
+          </w:p>
+        </w:tc>
+        <w:tc>
+          <w:tcPr>
+            <w:tcW w:type="dxa" w:w="1500"/>
+            <w:tcMar>
+              <w:top w:type="dxa" w:w="60"/>
+              <w:left w:type="dxa" w:w="100"/>
+              <w:bottom w:type="dxa" w:w="60"/>
+              <w:right w:type="dxa" w:w="100"/>
+            </w:tcMar>
+          </w:tcPr>
+          <w:p>
+            <w:r>
+              <w:rPr>
+                <w:rFonts w:ascii="Calibri" w:cs="Calibri" w:eastAsia="Calibri" w:hAnsi="Calibri"/>
+                <w:b w:val="false"/>
+                <w:bCs w:val="false"/>
+                <w:sz w:val="20"/>
+                <w:szCs w:val="20"/>
+              </w:rPr>
+              <w:t xml:space="preserve">50%</w:t>
+            </w:r>
+          </w:p>
+        </w:tc>
+        <w:tc>
+          <w:tcPr>
+            <w:tcW w:type="dxa" w:w="1500"/>
+            <w:tcMar>
+              <w:top w:type="dxa" w:w="60"/>
+              <w:left w:type="dxa" w:w="100"/>
+              <w:bottom w:type="dxa" w:w="60"/>
+              <w:right w:type="dxa" w:w="100"/>
+            </w:tcMar>
+          </w:tcPr>
+          <w:p>
+            <w:r>
+              <w:rPr>
+                <w:rFonts w:ascii="Calibri" w:cs="Calibri" w:eastAsia="Calibri" w:hAnsi="Calibri"/>
+                <w:b w:val="false"/>
+                <w:bCs w:val="false"/>
+                <w:sz w:val="20"/>
+                <w:szCs w:val="20"/>
+              </w:rPr>
               <w:t xml:space="preserve">100%</w:t>
             </w:r>
           </w:p>
@@ -10009,53 +10337,7 @@
                 <w:sz w:val="20"/>
                 <w:szCs w:val="20"/>
               </w:rPr>
-              <w:t xml:space="preserve">75%</w:t>
-            </w:r>
-          </w:p>
-        </w:tc>
-        <w:tc>
-          <w:tcPr>
-            <w:tcW w:type="dxa" w:w="1500"/>
-            <w:tcMar>
-              <w:top w:type="dxa" w:w="60"/>
-              <w:left w:type="dxa" w:w="100"/>
-              <w:bottom w:type="dxa" w:w="60"/>
-              <w:right w:type="dxa" w:w="100"/>
-            </w:tcMar>
-          </w:tcPr>
-          <w:p>
-            <w:r>
-              <w:rPr>
-                <w:rFonts w:ascii="Calibri" w:cs="Calibri" w:eastAsia="Calibri" w:hAnsi="Calibri"/>
-                <w:b w:val="false"/>
-                <w:bCs w:val="false"/>
-                <w:sz w:val="20"/>
-                <w:szCs w:val="20"/>
-              </w:rPr>
-              <w:t xml:space="preserve">100%</w:t>
-            </w:r>
-          </w:p>
-        </w:tc>
-        <w:tc>
-          <w:tcPr>
-            <w:tcW w:type="dxa" w:w="1500"/>
-            <w:tcMar>
-              <w:top w:type="dxa" w:w="60"/>
-              <w:left w:type="dxa" w:w="100"/>
-              <w:bottom w:type="dxa" w:w="60"/>
-              <w:right w:type="dxa" w:w="100"/>
-            </w:tcMar>
-          </w:tcPr>
-          <w:p>
-            <w:r>
-              <w:rPr>
-                <w:rFonts w:ascii="Calibri" w:cs="Calibri" w:eastAsia="Calibri" w:hAnsi="Calibri"/>
-                <w:b w:val="false"/>
-                <w:bCs w:val="false"/>
-                <w:sz w:val="20"/>
-                <w:szCs w:val="20"/>
-              </w:rPr>
-              <w:t xml:space="preserve">100%</w:t>
+              <w:t xml:space="preserve">83.33%</w:t>
             </w:r>
           </w:p>
         </w:tc>
@@ -10080,7 +10362,7 @@
                 <w:sz w:val="20"/>
                 <w:szCs w:val="20"/>
               </w:rPr>
-              <w:t xml:space="preserve">pages/Contacto.jsx</w:t>
+              <w:t xml:space="preserve">pages/CompraFallida.jsx</w:t>
             </w:r>
           </w:p>
         </w:tc>
@@ -10126,7 +10408,7 @@
                 <w:sz w:val="20"/>
                 <w:szCs w:val="20"/>
               </w:rPr>
-              <w:t xml:space="preserve">100%</w:t>
+              <w:t xml:space="preserve">75%</w:t>
             </w:r>
           </w:p>
         </w:tc>
@@ -10197,7 +10479,7 @@
                 <w:sz w:val="20"/>
                 <w:szCs w:val="20"/>
               </w:rPr>
-              <w:t xml:space="preserve">pages/Login.jsx</w:t>
+              <w:t xml:space="preserve">pages/Contacto.jsx</w:t>
             </w:r>
           </w:p>
         </w:tc>
@@ -10220,7 +10502,7 @@
                 <w:sz w:val="20"/>
                 <w:szCs w:val="20"/>
               </w:rPr>
-              <w:t xml:space="preserve">94.11%</w:t>
+              <w:t xml:space="preserve">100%</w:t>
             </w:r>
           </w:p>
         </w:tc>
@@ -10243,7 +10525,7 @@
                 <w:sz w:val="20"/>
                 <w:szCs w:val="20"/>
               </w:rPr>
-              <w:t xml:space="preserve">80%</w:t>
+              <w:t xml:space="preserve">100%</w:t>
             </w:r>
           </w:p>
         </w:tc>
@@ -10289,7 +10571,7 @@
                 <w:sz w:val="20"/>
                 <w:szCs w:val="20"/>
               </w:rPr>
-              <w:t xml:space="preserve">94.11%</w:t>
+              <w:t xml:space="preserve">100%</w:t>
             </w:r>
           </w:p>
         </w:tc>
@@ -10314,7 +10596,7 @@
                 <w:sz w:val="20"/>
                 <w:szCs w:val="20"/>
               </w:rPr>
-              <w:t xml:space="preserve">pages/Productos.jsx</w:t>
+              <w:t xml:space="preserve">pages/Login.jsx</w:t>
             </w:r>
           </w:p>
         </w:tc>
@@ -10337,7 +10619,7 @@
                 <w:sz w:val="20"/>
                 <w:szCs w:val="20"/>
               </w:rPr>
-              <w:t xml:space="preserve">90%</w:t>
+              <w:t xml:space="preserve">94.11%</w:t>
             </w:r>
           </w:p>
         </w:tc>
@@ -10360,6 +10642,29 @@
                 <w:sz w:val="20"/>
                 <w:szCs w:val="20"/>
               </w:rPr>
+              <w:t xml:space="preserve">80%</w:t>
+            </w:r>
+          </w:p>
+        </w:tc>
+        <w:tc>
+          <w:tcPr>
+            <w:tcW w:type="dxa" w:w="1500"/>
+            <w:tcMar>
+              <w:top w:type="dxa" w:w="60"/>
+              <w:left w:type="dxa" w:w="100"/>
+              <w:bottom w:type="dxa" w:w="60"/>
+              <w:right w:type="dxa" w:w="100"/>
+            </w:tcMar>
+          </w:tcPr>
+          <w:p>
+            <w:r>
+              <w:rPr>
+                <w:rFonts w:ascii="Calibri" w:cs="Calibri" w:eastAsia="Calibri" w:hAnsi="Calibri"/>
+                <w:b w:val="false"/>
+                <w:bCs w:val="false"/>
+                <w:sz w:val="20"/>
+                <w:szCs w:val="20"/>
+              </w:rPr>
               <w:t xml:space="preserve">100%</w:t>
             </w:r>
           </w:p>
@@ -10383,30 +10688,7 @@
                 <w:sz w:val="20"/>
                 <w:szCs w:val="20"/>
               </w:rPr>
-              <w:t xml:space="preserve">50%</w:t>
-            </w:r>
-          </w:p>
-        </w:tc>
-        <w:tc>
-          <w:tcPr>
-            <w:tcW w:type="dxa" w:w="1500"/>
-            <w:tcMar>
-              <w:top w:type="dxa" w:w="60"/>
-              <w:left w:type="dxa" w:w="100"/>
-              <w:bottom w:type="dxa" w:w="60"/>
-              <w:right w:type="dxa" w:w="100"/>
-            </w:tcMar>
-          </w:tcPr>
-          <w:p>
-            <w:r>
-              <w:rPr>
-                <w:rFonts w:ascii="Calibri" w:cs="Calibri" w:eastAsia="Calibri" w:hAnsi="Calibri"/>
-                <w:b w:val="false"/>
-                <w:bCs w:val="false"/>
-                <w:sz w:val="20"/>
-                <w:szCs w:val="20"/>
-              </w:rPr>
-              <w:t xml:space="preserve">90%</w:t>
+              <w:t xml:space="preserve">94.11%</w:t>
             </w:r>
           </w:p>
         </w:tc>
@@ -10431,7 +10713,7 @@
                 <w:sz w:val="20"/>
                 <w:szCs w:val="20"/>
               </w:rPr>
-              <w:t xml:space="preserve">pages/Registro.jsx</w:t>
+              <w:t xml:space="preserve">pages/Productos.jsx</w:t>
             </w:r>
           </w:p>
         </w:tc>
@@ -10454,7 +10736,7 @@
                 <w:sz w:val="20"/>
                 <w:szCs w:val="20"/>
               </w:rPr>
-              <w:t xml:space="preserve">96%</w:t>
+              <w:t xml:space="preserve">90%</w:t>
             </w:r>
           </w:p>
         </w:tc>
@@ -10477,7 +10759,7 @@
                 <w:sz w:val="20"/>
                 <w:szCs w:val="20"/>
               </w:rPr>
-              <w:t xml:space="preserve">80%</w:t>
+              <w:t xml:space="preserve">100%</w:t>
             </w:r>
           </w:p>
         </w:tc>
@@ -10500,30 +10782,30 @@
                 <w:sz w:val="20"/>
                 <w:szCs w:val="20"/>
               </w:rPr>
+              <w:t xml:space="preserve">50%</w:t>
+            </w:r>
+          </w:p>
+        </w:tc>
+        <w:tc>
+          <w:tcPr>
+            <w:tcW w:type="dxa" w:w="1500"/>
+            <w:tcMar>
+              <w:top w:type="dxa" w:w="60"/>
+              <w:left w:type="dxa" w:w="100"/>
+              <w:bottom w:type="dxa" w:w="60"/>
+              <w:right w:type="dxa" w:w="100"/>
+            </w:tcMar>
+          </w:tcPr>
+          <w:p>
+            <w:r>
+              <w:rPr>
+                <w:rFonts w:ascii="Calibri" w:cs="Calibri" w:eastAsia="Calibri" w:hAnsi="Calibri"/>
+                <w:b w:val="false"/>
+                <w:bCs w:val="false"/>
+                <w:sz w:val="20"/>
+                <w:szCs w:val="20"/>
+              </w:rPr>
               <w:t xml:space="preserve">90%</w:t>
-            </w:r>
-          </w:p>
-        </w:tc>
-        <w:tc>
-          <w:tcPr>
-            <w:tcW w:type="dxa" w:w="1500"/>
-            <w:tcMar>
-              <w:top w:type="dxa" w:w="60"/>
-              <w:left w:type="dxa" w:w="100"/>
-              <w:bottom w:type="dxa" w:w="60"/>
-              <w:right w:type="dxa" w:w="100"/>
-            </w:tcMar>
-          </w:tcPr>
-          <w:p>
-            <w:r>
-              <w:rPr>
-                <w:rFonts w:ascii="Calibri" w:cs="Calibri" w:eastAsia="Calibri" w:hAnsi="Calibri"/>
-                <w:b w:val="false"/>
-                <w:bCs w:val="false"/>
-                <w:sz w:val="20"/>
-                <w:szCs w:val="20"/>
-              </w:rPr>
-              <w:t xml:space="preserve">95.83%</w:t>
             </w:r>
           </w:p>
         </w:tc>
@@ -10548,7 +10830,7 @@
                 <w:sz w:val="20"/>
                 <w:szCs w:val="20"/>
               </w:rPr>
-              <w:t xml:space="preserve">pages/admin/AdminPedidos.jsx</w:t>
+              <w:t xml:space="preserve">pages/Registro.jsx</w:t>
             </w:r>
           </w:p>
         </w:tc>
@@ -10571,7 +10853,7 @@
                 <w:sz w:val="20"/>
                 <w:szCs w:val="20"/>
               </w:rPr>
-              <w:t xml:space="preserve">88.88%</w:t>
+              <w:t xml:space="preserve">96%</w:t>
             </w:r>
           </w:p>
         </w:tc>
@@ -10594,7 +10876,7 @@
                 <w:sz w:val="20"/>
                 <w:szCs w:val="20"/>
               </w:rPr>
-              <w:t xml:space="preserve">100%</w:t>
+              <w:t xml:space="preserve">80%</w:t>
             </w:r>
           </w:p>
         </w:tc>
@@ -10617,7 +10899,7 @@
                 <w:sz w:val="20"/>
                 <w:szCs w:val="20"/>
               </w:rPr>
-              <w:t xml:space="preserve">80%</w:t>
+              <w:t xml:space="preserve">90%</w:t>
             </w:r>
           </w:p>
         </w:tc>
@@ -10640,7 +10922,7 @@
                 <w:sz w:val="20"/>
                 <w:szCs w:val="20"/>
               </w:rPr>
-              <w:t xml:space="preserve">88.88%</w:t>
+              <w:t xml:space="preserve">95.83%</w:t>
             </w:r>
           </w:p>
         </w:tc>
@@ -10665,7 +10947,7 @@
                 <w:sz w:val="20"/>
                 <w:szCs w:val="20"/>
               </w:rPr>
-              <w:t xml:space="preserve">pages/admin/AdminProductos.jsx</w:t>
+              <w:t xml:space="preserve">pages/admin/AdminPedidos.jsx</w:t>
             </w:r>
           </w:p>
         </w:tc>
@@ -10688,7 +10970,7 @@
                 <w:sz w:val="20"/>
                 <w:szCs w:val="20"/>
               </w:rPr>
-              <w:t xml:space="preserve">69.81%</w:t>
+              <w:t xml:space="preserve">88.88%</w:t>
             </w:r>
           </w:p>
         </w:tc>
@@ -10711,7 +10993,7 @@
                 <w:sz w:val="20"/>
                 <w:szCs w:val="20"/>
               </w:rPr>
-              <w:t xml:space="preserve">55.31%</w:t>
+              <w:t xml:space="preserve">100%</w:t>
             </w:r>
           </w:p>
         </w:tc>
@@ -10734,7 +11016,7 @@
                 <w:sz w:val="20"/>
                 <w:szCs w:val="20"/>
               </w:rPr>
-              <w:t xml:space="preserve">68.42%</w:t>
+              <w:t xml:space="preserve">80%</w:t>
             </w:r>
           </w:p>
         </w:tc>
@@ -10757,7 +11039,7 @@
                 <w:sz w:val="20"/>
                 <w:szCs w:val="20"/>
               </w:rPr>
-              <w:t xml:space="preserve">69.23%</w:t>
+              <w:t xml:space="preserve">88.88%</w:t>
             </w:r>
           </w:p>
         </w:tc>
@@ -10782,7 +11064,7 @@
                 <w:sz w:val="20"/>
                 <w:szCs w:val="20"/>
               </w:rPr>
-              <w:t xml:space="preserve">pages/admin/AdminUsuarios.jsx</w:t>
+              <w:t xml:space="preserve">pages/admin/AdminProductos.jsx</w:t>
             </w:r>
           </w:p>
         </w:tc>
@@ -10805,7 +11087,7 @@
                 <w:sz w:val="20"/>
                 <w:szCs w:val="20"/>
               </w:rPr>
-              <w:t xml:space="preserve">66.66%</w:t>
+              <w:t xml:space="preserve">69.81%</w:t>
             </w:r>
           </w:p>
         </w:tc>
@@ -10828,7 +11110,7 @@
                 <w:sz w:val="20"/>
                 <w:szCs w:val="20"/>
               </w:rPr>
-              <w:t xml:space="preserve">75%</w:t>
+              <w:t xml:space="preserve">55.31%</w:t>
             </w:r>
           </w:p>
         </w:tc>
@@ -10851,7 +11133,7 @@
                 <w:sz w:val="20"/>
                 <w:szCs w:val="20"/>
               </w:rPr>
-              <w:t xml:space="preserve">66.66%</w:t>
+              <w:t xml:space="preserve">68.42%</w:t>
             </w:r>
           </w:p>
         </w:tc>
@@ -10874,7 +11156,7 @@
                 <w:sz w:val="20"/>
                 <w:szCs w:val="20"/>
               </w:rPr>
-              <w:t xml:space="preserve">66.66%</w:t>
+              <w:t xml:space="preserve">69.23%</w:t>
             </w:r>
           </w:p>
         </w:tc>
@@ -10899,7 +11181,7 @@
                 <w:sz w:val="20"/>
                 <w:szCs w:val="20"/>
               </w:rPr>
-              <w:t xml:space="preserve">utils/filtros.js</w:t>
+              <w:t xml:space="preserve">pages/admin/AdminUsuarios.jsx</w:t>
             </w:r>
           </w:p>
         </w:tc>
@@ -10922,7 +11204,7 @@
                 <w:sz w:val="20"/>
                 <w:szCs w:val="20"/>
               </w:rPr>
-              <w:t xml:space="preserve">80%</w:t>
+              <w:t xml:space="preserve">66.66%</w:t>
             </w:r>
           </w:p>
         </w:tc>
@@ -10945,7 +11227,7 @@
                 <w:sz w:val="20"/>
                 <w:szCs w:val="20"/>
               </w:rPr>
-              <w:t xml:space="preserve">86.66%</w:t>
+              <w:t xml:space="preserve">75%</w:t>
             </w:r>
           </w:p>
         </w:tc>
@@ -10968,7 +11250,7 @@
                 <w:sz w:val="20"/>
                 <w:szCs w:val="20"/>
               </w:rPr>
-              <w:t xml:space="preserve">71.42%</w:t>
+              <w:t xml:space="preserve">66.66%</w:t>
             </w:r>
           </w:p>
         </w:tc>
@@ -10991,7 +11273,7 @@
                 <w:sz w:val="20"/>
                 <w:szCs w:val="20"/>
               </w:rPr>
-              <w:t xml:space="preserve">88.23%</w:t>
+              <w:t xml:space="preserve">66.66%</w:t>
             </w:r>
           </w:p>
         </w:tc>
@@ -11016,7 +11298,7 @@
                 <w:sz w:val="20"/>
                 <w:szCs w:val="20"/>
               </w:rPr>
-              <w:t xml:space="preserve">utils/formato.js</w:t>
+              <w:t xml:space="preserve">utils/filtros.js</w:t>
             </w:r>
           </w:p>
         </w:tc>
@@ -11039,7 +11321,7 @@
                 <w:sz w:val="20"/>
                 <w:szCs w:val="20"/>
               </w:rPr>
-              <w:t xml:space="preserve">100%</w:t>
+              <w:t xml:space="preserve">80%</w:t>
             </w:r>
           </w:p>
         </w:tc>
@@ -11062,7 +11344,7 @@
                 <w:sz w:val="20"/>
                 <w:szCs w:val="20"/>
               </w:rPr>
-              <w:t xml:space="preserve">100%</w:t>
+              <w:t xml:space="preserve">86.66%</w:t>
             </w:r>
           </w:p>
         </w:tc>
@@ -11085,7 +11367,7 @@
                 <w:sz w:val="20"/>
                 <w:szCs w:val="20"/>
               </w:rPr>
-              <w:t xml:space="preserve">100%</w:t>
+              <w:t xml:space="preserve">71.42%</w:t>
             </w:r>
           </w:p>
         </w:tc>
@@ -11108,7 +11390,7 @@
                 <w:sz w:val="20"/>
                 <w:szCs w:val="20"/>
               </w:rPr>
-              <w:t xml:space="preserve">100%</w:t>
+              <w:t xml:space="preserve">88.23%</w:t>
             </w:r>
           </w:p>
         </w:tc>
@@ -11133,7 +11415,7 @@
                 <w:sz w:val="20"/>
                 <w:szCs w:val="20"/>
               </w:rPr>
-              <w:t xml:space="preserve">utils/validaciones.js</w:t>
+              <w:t xml:space="preserve">utils/formato.js</w:t>
             </w:r>
           </w:p>
         </w:tc>
@@ -11250,6 +11532,123 @@
                 <w:sz w:val="20"/>
                 <w:szCs w:val="20"/>
               </w:rPr>
+              <w:t xml:space="preserve">utils/validaciones.js</w:t>
+            </w:r>
+          </w:p>
+        </w:tc>
+        <w:tc>
+          <w:tcPr>
+            <w:tcW w:type="dxa" w:w="1500"/>
+            <w:tcMar>
+              <w:top w:type="dxa" w:w="60"/>
+              <w:left w:type="dxa" w:w="100"/>
+              <w:bottom w:type="dxa" w:w="60"/>
+              <w:right w:type="dxa" w:w="100"/>
+            </w:tcMar>
+          </w:tcPr>
+          <w:p>
+            <w:r>
+              <w:rPr>
+                <w:rFonts w:ascii="Calibri" w:cs="Calibri" w:eastAsia="Calibri" w:hAnsi="Calibri"/>
+                <w:b w:val="false"/>
+                <w:bCs w:val="false"/>
+                <w:sz w:val="20"/>
+                <w:szCs w:val="20"/>
+              </w:rPr>
+              <w:t xml:space="preserve">100%</w:t>
+            </w:r>
+          </w:p>
+        </w:tc>
+        <w:tc>
+          <w:tcPr>
+            <w:tcW w:type="dxa" w:w="1500"/>
+            <w:tcMar>
+              <w:top w:type="dxa" w:w="60"/>
+              <w:left w:type="dxa" w:w="100"/>
+              <w:bottom w:type="dxa" w:w="60"/>
+              <w:right w:type="dxa" w:w="100"/>
+            </w:tcMar>
+          </w:tcPr>
+          <w:p>
+            <w:r>
+              <w:rPr>
+                <w:rFonts w:ascii="Calibri" w:cs="Calibri" w:eastAsia="Calibri" w:hAnsi="Calibri"/>
+                <w:b w:val="false"/>
+                <w:bCs w:val="false"/>
+                <w:sz w:val="20"/>
+                <w:szCs w:val="20"/>
+              </w:rPr>
+              <w:t xml:space="preserve">100%</w:t>
+            </w:r>
+          </w:p>
+        </w:tc>
+        <w:tc>
+          <w:tcPr>
+            <w:tcW w:type="dxa" w:w="1500"/>
+            <w:tcMar>
+              <w:top w:type="dxa" w:w="60"/>
+              <w:left w:type="dxa" w:w="100"/>
+              <w:bottom w:type="dxa" w:w="60"/>
+              <w:right w:type="dxa" w:w="100"/>
+            </w:tcMar>
+          </w:tcPr>
+          <w:p>
+            <w:r>
+              <w:rPr>
+                <w:rFonts w:ascii="Calibri" w:cs="Calibri" w:eastAsia="Calibri" w:hAnsi="Calibri"/>
+                <w:b w:val="false"/>
+                <w:bCs w:val="false"/>
+                <w:sz w:val="20"/>
+                <w:szCs w:val="20"/>
+              </w:rPr>
+              <w:t xml:space="preserve">100%</w:t>
+            </w:r>
+          </w:p>
+        </w:tc>
+        <w:tc>
+          <w:tcPr>
+            <w:tcW w:type="dxa" w:w="1500"/>
+            <w:tcMar>
+              <w:top w:type="dxa" w:w="60"/>
+              <w:left w:type="dxa" w:w="100"/>
+              <w:bottom w:type="dxa" w:w="60"/>
+              <w:right w:type="dxa" w:w="100"/>
+            </w:tcMar>
+          </w:tcPr>
+          <w:p>
+            <w:r>
+              <w:rPr>
+                <w:rFonts w:ascii="Calibri" w:cs="Calibri" w:eastAsia="Calibri" w:hAnsi="Calibri"/>
+                <w:b w:val="false"/>
+                <w:bCs w:val="false"/>
+                <w:sz w:val="20"/>
+                <w:szCs w:val="20"/>
+              </w:rPr>
+              <w:t xml:space="preserve">100%</w:t>
+            </w:r>
+          </w:p>
+        </w:tc>
+      </w:tr>
+      <w:tr>
+        <w:tc>
+          <w:tcPr>
+            <w:tcW w:type="dxa" w:w="3600"/>
+            <w:tcMar>
+              <w:top w:type="dxa" w:w="60"/>
+              <w:left w:type="dxa" w:w="100"/>
+              <w:bottom w:type="dxa" w:w="60"/>
+              <w:right w:type="dxa" w:w="100"/>
+            </w:tcMar>
+          </w:tcPr>
+          <w:p>
+            <w:r>
+              <w:rPr>
+                <w:rFonts w:ascii="Calibri" w:cs="Calibri" w:eastAsia="Calibri" w:hAnsi="Calibri"/>
+                <w:b w:val="false"/>
+                <w:bCs w:val="false"/>
+                <w:sz w:val="20"/>
+                <w:szCs w:val="20"/>
+              </w:rPr>
               <w:t xml:space="preserve">TOTAL</w:t>
             </w:r>
           </w:p>
@@ -11273,7 +11672,7 @@
                 <w:sz w:val="20"/>
                 <w:szCs w:val="20"/>
               </w:rPr>
-              <w:t xml:space="preserve">86.52%</w:t>
+              <w:t xml:space="preserve">86.68%</w:t>
             </w:r>
           </w:p>
         </w:tc>
@@ -11296,7 +11695,7 @@
                 <w:sz w:val="20"/>
                 <w:szCs w:val="20"/>
               </w:rPr>
-              <w:t xml:space="preserve">77.72%</w:t>
+              <w:t xml:space="preserve">78.11%</w:t>
             </w:r>
           </w:p>
         </w:tc>
@@ -11319,7 +11718,7 @@
                 <w:sz w:val="20"/>
                 <w:szCs w:val="20"/>
               </w:rPr>
-              <w:t xml:space="preserve">81.06%</w:t>
+              <w:t xml:space="preserve">81.28%</w:t>
             </w:r>
           </w:p>
         </w:tc>
@@ -11342,7 +11741,7 @@
                 <w:sz w:val="20"/>
                 <w:szCs w:val="20"/>
               </w:rPr>
-              <w:t xml:space="preserve">87.35%</w:t>
+              <w:t xml:space="preserve">87.5%</w:t>
             </w:r>
           </w:p>
         </w:tc>
@@ -11434,7 +11833,7 @@
           <w:sz w:val="22"/>
           <w:szCs w:val="22"/>
         </w:rPr>
-        <w:t xml:space="preserve">El objetivo era cubrir las funcionalidades principales (catálogo, carrito, autenticación, checkout y administración), y eso se cumple con una cobertura total de 86.52% en sentencias.</w:t>
+        <w:t xml:space="preserve">El objetivo era cubrir las funcionalidades principales (catálogo, carrito, autenticación, checkout y administración), y eso se cumple con una cobertura total de 86.68% en sentencias.</w:t>
       </w:r>
     </w:p>
     <w:p>
@@ -11535,7 +11934,7 @@
           <w:sz w:val="22"/>
           <w:szCs w:val="22"/>
         </w:rPr>
-        <w:t xml:space="preserve">El proyecto cuenta con un proceso de pruebas unitarias funcionando: entorno configurado con Karma y Jasmine, 63 pruebas que verifican lógica, renderizado, props, estado y eventos, uso de mocks y un reporte de cobertura. Esto permite detectar errores al modificar el código y asegura que las funcionalidades principales de la tienda sigan funcionando.</w:t>
+        <w:t xml:space="preserve">El proyecto cuenta con un proceso de pruebas unitarias funcionando: entorno configurado con Karma y Jasmine, 66 pruebas que verifican lógica, renderizado, props, estado y eventos, uso de mocks y un reporte de cobertura. Esto permite detectar errores al modificar el código y asegura que las funcionalidades principales de la tienda sigan funcionando.</w:t>
       </w:r>
     </w:p>
     <w:sectPr>

</xml_diff>